<commit_message>
Report: author name; drop cost-report and first-attempt sentences
Co-Authored-By: Claude Opus 5.5 <noreply@anthropic.com>
Claude-Session: https://claude.ai/code/session_01NxppRwts4oy9wUa1ixM1qT
</commit_message>
<xml_diff>
--- a/report/REPORT.docx
+++ b/report/REPORT.docx
@@ -165,7 +165,7 @@
         <w:t xml:space="preserve"> </w:t>
       </w:r>
       <w:r>
-        <w:t xml:space="preserve">· [Author name] · October 2026</w:t>
+        <w:t xml:space="preserve">· Shantanu P. Sontakke · October 2026</w:t>
       </w:r>
       <w:r>
         <w:br/>
@@ -9413,7 +9413,7 @@
         <w:t xml:space="preserve"> </w:t>
       </w:r>
       <w:r>
-        <w:t xml:space="preserve">than the main test. These changes were also made after the results of an earlier, incomplete Study 1 attempt with different models had been seen; that attempt was set aside and is not reported here. The game reallocation was triggered by an overstated noise estimate (Section 4.5).</w:t>
+        <w:t xml:space="preserve">than the main test. The game reallocation was triggered by an overstated noise estimate (Section 4.5).</w:t>
       </w:r>
     </w:p>
     <w:p>
@@ -9545,7 +9545,7 @@
         <w:t xml:space="preserve"> </w:t>
       </w:r>
       <w:r>
-        <w:t xml:space="preserve">The pre-registered joint gain and harm analysis (scores and survival by version) and the pre-registered cost report. Our intervals come from resampling games (</w:t>
+        <w:t xml:space="preserve">The pre-registered joint gain and harm analysis (scores and survival by version). Our intervals come from resampling games (</w:t>
       </w:r>
       <w:r>
         <w:t xml:space="preserve">“</w:t>

</xml_diff>

<commit_message>
Submission: final check fixes; long report: three corrections
Submission: 'no measurable' wording where the data show no significant
change; 'rarely' for the channel's protective use; Study 2 conclusion
scoped to its own models; interview after each Study 1 game; PDF added.
Long report (linked from the submission): abstract quote now verbatim
("let's not challenge each other"), p = 0.029 and p = 0.0003.

Co-Authored-By: Claude Opus 5.5 <noreply@anthropic.com>
Claude-Session: https://claude.ai/code/session_01NxppRwts4oy9wUa1ixM1qT
</commit_message>
<xml_diff>
--- a/report/REPORT.docx
+++ b/report/REPORT.docx
@@ -255,7 +255,7 @@
         <w:t xml:space="preserve">“</w:t>
       </w:r>
       <w:r>
-        <w:t xml:space="preserve">let’s never challenge each other</w:t>
+        <w:t xml:space="preserve">let’s not challenge each other</w:t>
       </w:r>
       <w:r>
         <w:t xml:space="preserve">”</w:t>
@@ -9065,7 +9065,7 @@
         <w:t xml:space="preserve"> </w:t>
       </w:r>
       <w:r>
-        <w:t xml:space="preserve">Compared with the no-offer version, the hint raised favouritism by +10.3 points per decision (p = 0.026) and +15.9 per game (p = 0.0075). Without the loop games, these are +8.1 (p = 0.092) and +13.4 (p = 0.030). This comparison was not pre-registered, and it mixes the hint with H’s enforced leniency, because in C0 H may challenge.</w:t>
+        <w:t xml:space="preserve">Compared with the no-offer version, the hint raised favouritism by +10.3 points per decision (p = 0.026) and +15.9 per game (p = 0.0075). Without the loop games, these are +8.1 (p = 0.092) and +13.4 (p = 0.029). This comparison was not pre-registered, and it mixes the hint with H’s enforced leniency, because in C0 H may challenge.</w:t>
       </w:r>
     </w:p>
     <w:p>
@@ -9087,7 +9087,7 @@
         <w:t xml:space="preserve"> </w:t>
       </w:r>
       <w:r>
-        <w:t xml:space="preserve">A tested agent was the first player eliminated in 312 of 540 games (57.8%, where an even game would give 50%; p = 0.0004). The Gemma seats won 365 of 540 games (67.6%), but mostly through H in the versions where the program stops H from challenging, which also spares H the risk of losing a challenge. In the no-offer version, where H plays freely, the Gemma seats won 40 of 72 games (55.6%), close to an even share. As a result, the tested agents judged few of H’s or S’s claims per game: a median of 24 for Ministral 3 14B, 11 for Qwen3.5 9B and 10 for Ministral 3 8B. This makes smaller effects harder to detect.</w:t>
+        <w:t xml:space="preserve">A tested agent was the first player eliminated in 312 of 540 games (57.8%, where an even game would give 50%; p = 0.0003). The Gemma seats won 365 of 540 games (67.6%), but mostly through H in the versions where the program stops H from challenging, which also spares H the risk of losing a challenge. In the no-offer version, where H plays freely, the Gemma seats won 40 of 72 games (55.6%), close to an even share. As a result, the tested agents judged few of H’s or S’s claims per game: a median of 24 for Ministral 3 14B, 11 for Qwen3.5 9B and 10 for Ministral 3 8B. This makes smaller effects harder to detect.</w:t>
       </w:r>
     </w:p>
     <w:p>

</xml_diff>